<commit_message>
Team 4: fix: changed table "view name and number" to include "/ Logout"
</commit_message>
<xml_diff>
--- a/04_QA_Review/Pending_Review/CS_M2_Team4_1.1LoginLogoutScreen_v01.docx
+++ b/04_QA_Review/Pending_Review/CS_M2_Team4_1.1LoginLogoutScreen_v01.docx
@@ -357,7 +357,7 @@
                 <w:sz w:val="22"/>
                 <w:szCs w:val="22"/>
               </w:rPr>
-              <w:t>1.1 – Login Screen</w:t>
+              <w:t>1.1 Login / Logout Screen</w:t>
             </w:r>
           </w:p>
         </w:tc>
@@ -793,25 +793,7 @@
                 <w:sz w:val="22"/>
                 <w:szCs w:val="22"/>
               </w:rPr>
-              <w:t xml:space="preserve">Email and Password fields, Login button click, </w:t>
-            </w:r>
-            <w:proofErr w:type="gramStart"/>
-            <w:r>
-              <w:rPr>
-                <w:rFonts w:ascii="Arial" w:hAnsi="Arial" w:cs="Arial"/>
-                <w:sz w:val="22"/>
-                <w:szCs w:val="22"/>
-              </w:rPr>
-              <w:t>Register</w:t>
-            </w:r>
-            <w:proofErr w:type="gramEnd"/>
-            <w:r>
-              <w:rPr>
-                <w:rFonts w:ascii="Arial" w:hAnsi="Arial" w:cs="Arial"/>
-                <w:sz w:val="22"/>
-                <w:szCs w:val="22"/>
-              </w:rPr>
-              <w:t xml:space="preserve"> link click, Forgot Password link click.</w:t>
+              <w:t>Email and Password fields, Login button click, Register link click, Forgot Password link click.</w:t>
             </w:r>
           </w:p>
         </w:tc>

</xml_diff>